<commit_message>
Modified title of publication
</commit_message>
<xml_diff>
--- a/code and data description.docx
+++ b/code and data description.docx
@@ -60,6 +60,12 @@
         <w:rPr>
           <w:lang w:val="en-US"/>
         </w:rPr>
+        <w:t xml:space="preserve">neuronal </w:t>
+      </w:r>
+      <w:r>
+        <w:rPr>
+          <w:lang w:val="en-US"/>
+        </w:rPr>
         <w:t>population clock</w:t>
       </w:r>
       <w:r>
@@ -122,7 +128,21 @@
         <w:rPr>
           <w:lang w:val="en-US"/>
         </w:rPr>
-        <w:t xml:space="preserve"> Kropf, C.B. Talbot and G. Miesenböck.</w:t>
+        <w:t xml:space="preserve"> Kropf, C.B. Talbot and G. </w:t>
+      </w:r>
+      <w:proofErr w:type="spellStart"/>
+      <w:r>
+        <w:rPr>
+          <w:lang w:val="en-US"/>
+        </w:rPr>
+        <w:t>Miesenböck</w:t>
+      </w:r>
+      <w:proofErr w:type="spellEnd"/>
+      <w:r>
+        <w:rPr>
+          <w:lang w:val="en-US"/>
+        </w:rPr>
+        <w:t>.</w:t>
       </w:r>
     </w:p>
     <w:p>
@@ -261,7 +281,35 @@
         <w:rPr>
           <w:lang w:val="en-US"/>
         </w:rPr>
-        <w:t xml:space="preserve">The “+BayesianFns” and “+BehaviourFns” </w:t>
+        <w:t>The “+</w:t>
+      </w:r>
+      <w:proofErr w:type="spellStart"/>
+      <w:r>
+        <w:rPr>
+          <w:lang w:val="en-US"/>
+        </w:rPr>
+        <w:t>BayesianFns</w:t>
+      </w:r>
+      <w:proofErr w:type="spellEnd"/>
+      <w:r>
+        <w:rPr>
+          <w:lang w:val="en-US"/>
+        </w:rPr>
+        <w:t>” and “+</w:t>
+      </w:r>
+      <w:proofErr w:type="spellStart"/>
+      <w:r>
+        <w:rPr>
+          <w:lang w:val="en-US"/>
+        </w:rPr>
+        <w:t>BehaviourFns</w:t>
+      </w:r>
+      <w:proofErr w:type="spellEnd"/>
+      <w:r>
+        <w:rPr>
+          <w:lang w:val="en-US"/>
+        </w:rPr>
+        <w:t xml:space="preserve">” </w:t>
       </w:r>
       <w:r>
         <w:rPr>
@@ -402,7 +450,21 @@
         <w:rPr>
           <w:lang w:val="en-US"/>
         </w:rPr>
-        <w:t xml:space="preserve"> odour </w:t>
+        <w:t xml:space="preserve"> </w:t>
+      </w:r>
+      <w:proofErr w:type="spellStart"/>
+      <w:r>
+        <w:rPr>
+          <w:lang w:val="en-US"/>
+        </w:rPr>
+        <w:t>odour</w:t>
+      </w:r>
+      <w:proofErr w:type="spellEnd"/>
+      <w:r>
+        <w:rPr>
+          <w:lang w:val="en-US"/>
+        </w:rPr>
+        <w:t xml:space="preserve"> </w:t>
       </w:r>
       <w:r>
         <w:rPr>
@@ -492,7 +554,21 @@
         <w:rPr>
           <w:lang w:val="en-US"/>
         </w:rPr>
-        <w:t xml:space="preserve">Set the parameter “dataSetID” in the first line of code according to the comments to select the 4-, or 10-second recordings and then run the script. </w:t>
+        <w:t>Set the parameter “</w:t>
+      </w:r>
+      <w:proofErr w:type="spellStart"/>
+      <w:r>
+        <w:rPr>
+          <w:lang w:val="en-US"/>
+        </w:rPr>
+        <w:t>dataSetID</w:t>
+      </w:r>
+      <w:proofErr w:type="spellEnd"/>
+      <w:r>
+        <w:rPr>
+          <w:lang w:val="en-US"/>
+        </w:rPr>
+        <w:t xml:space="preserve">” in the first line of code according to the comments to select the 4-, or 10-second recordings and then run the script. </w:t>
       </w:r>
       <w:r>
         <w:rPr>
@@ -740,7 +816,21 @@
         <w:rPr>
           <w:lang w:val="en-US"/>
         </w:rPr>
-        <w:t xml:space="preserve">The code to extract and sort the behaviour data </w:t>
+        <w:t xml:space="preserve">The code to extract and sort the </w:t>
+      </w:r>
+      <w:proofErr w:type="spellStart"/>
+      <w:r>
+        <w:rPr>
+          <w:lang w:val="en-US"/>
+        </w:rPr>
+        <w:t>behaviour</w:t>
+      </w:r>
+      <w:proofErr w:type="spellEnd"/>
+      <w:r>
+        <w:rPr>
+          <w:lang w:val="en-US"/>
+        </w:rPr>
+        <w:t xml:space="preserve"> data </w:t>
       </w:r>
       <w:r>
         <w:rPr>
@@ -764,7 +854,21 @@
         <w:rPr>
           <w:lang w:val="en-US"/>
         </w:rPr>
-        <w:t xml:space="preserve"> as described in the first paragraph of the Methods subsection “Analysis of behavioural responses” and used to generate the figures 5a and extended 3b</w:t>
+        <w:t xml:space="preserve"> as described in the first paragraph of the Methods subsection “Analysis of </w:t>
+      </w:r>
+      <w:proofErr w:type="spellStart"/>
+      <w:r>
+        <w:rPr>
+          <w:lang w:val="en-US"/>
+        </w:rPr>
+        <w:t>behavioural</w:t>
+      </w:r>
+      <w:proofErr w:type="spellEnd"/>
+      <w:r>
+        <w:rPr>
+          <w:lang w:val="en-US"/>
+        </w:rPr>
+        <w:t xml:space="preserve"> responses” and used to generate the figures 5a and extended 3b</w:t>
       </w:r>
       <w:r>
         <w:rPr>
@@ -868,13 +972,41 @@
         <w:rPr>
           <w:lang w:val="en-US"/>
         </w:rPr>
-        <w:t xml:space="preserve">of the behavioural data </w:t>
-      </w:r>
-      <w:r>
-        <w:rPr>
-          <w:lang w:val="en-US"/>
-        </w:rPr>
-        <w:t xml:space="preserve">as described in the Methods subsection “Analysis of behavioural responses” and used to generate </w:t>
+        <w:t xml:space="preserve">of the </w:t>
+      </w:r>
+      <w:proofErr w:type="spellStart"/>
+      <w:r>
+        <w:rPr>
+          <w:lang w:val="en-US"/>
+        </w:rPr>
+        <w:t>behavioural</w:t>
+      </w:r>
+      <w:proofErr w:type="spellEnd"/>
+      <w:r>
+        <w:rPr>
+          <w:lang w:val="en-US"/>
+        </w:rPr>
+        <w:t xml:space="preserve"> data </w:t>
+      </w:r>
+      <w:r>
+        <w:rPr>
+          <w:lang w:val="en-US"/>
+        </w:rPr>
+        <w:t xml:space="preserve">as described in the Methods subsection “Analysis of </w:t>
+      </w:r>
+      <w:proofErr w:type="spellStart"/>
+      <w:r>
+        <w:rPr>
+          <w:lang w:val="en-US"/>
+        </w:rPr>
+        <w:t>behavioural</w:t>
+      </w:r>
+      <w:proofErr w:type="spellEnd"/>
+      <w:r>
+        <w:rPr>
+          <w:lang w:val="en-US"/>
+        </w:rPr>
+        <w:t xml:space="preserve"> responses” and used to generate </w:t>
       </w:r>
       <w:r>
         <w:rPr>
@@ -1012,16 +1144,36 @@
           <w:lang w:val="en-US"/>
         </w:rPr>
         <w:lastRenderedPageBreak/>
-        <w:t>+BayesianFns</w:t>
-      </w:r>
-      <w:r>
-        <w:rPr>
-          <w:b/>
-          <w:bCs/>
-          <w:lang w:val="en-US"/>
-        </w:rPr>
-        <w:t>\batchSlicesample.m</w:t>
-      </w:r>
+        <w:t>+</w:t>
+      </w:r>
+      <w:proofErr w:type="spellStart"/>
+      <w:r>
+        <w:rPr>
+          <w:b/>
+          <w:bCs/>
+          <w:lang w:val="en-US"/>
+        </w:rPr>
+        <w:t>BayesianFns</w:t>
+      </w:r>
+      <w:proofErr w:type="spellEnd"/>
+      <w:r>
+        <w:rPr>
+          <w:b/>
+          <w:bCs/>
+          <w:lang w:val="en-US"/>
+        </w:rPr>
+        <w:t>\</w:t>
+      </w:r>
+      <w:proofErr w:type="spellStart"/>
+      <w:r>
+        <w:rPr>
+          <w:b/>
+          <w:bCs/>
+          <w:lang w:val="en-US"/>
+        </w:rPr>
+        <w:t>batchSlicesample.m</w:t>
+      </w:r>
+      <w:proofErr w:type="spellEnd"/>
     </w:p>
     <w:p>
       <w:pPr>
@@ -1059,11 +1211,33 @@
         </w:rPr>
         <w:t xml:space="preserve"> </w:t>
       </w:r>
-      <w:r>
-        <w:rPr>
-          <w:lang w:val="en-US"/>
-        </w:rPr>
-        <w:t xml:space="preserve">Matlab inbuilt function “slicesample” </w:t>
+      <w:proofErr w:type="spellStart"/>
+      <w:r>
+        <w:rPr>
+          <w:lang w:val="en-US"/>
+        </w:rPr>
+        <w:t>Matlab</w:t>
+      </w:r>
+      <w:proofErr w:type="spellEnd"/>
+      <w:r>
+        <w:rPr>
+          <w:lang w:val="en-US"/>
+        </w:rPr>
+        <w:t xml:space="preserve"> inbuilt function “</w:t>
+      </w:r>
+      <w:proofErr w:type="spellStart"/>
+      <w:r>
+        <w:rPr>
+          <w:lang w:val="en-US"/>
+        </w:rPr>
+        <w:t>slicesample</w:t>
+      </w:r>
+      <w:proofErr w:type="spellEnd"/>
+      <w:r>
+        <w:rPr>
+          <w:lang w:val="en-US"/>
+        </w:rPr>
+        <w:t xml:space="preserve">” </w:t>
       </w:r>
       <w:r>
         <w:rPr>
@@ -1092,8 +1266,36 @@
           <w:bCs/>
           <w:lang w:val="en-US"/>
         </w:rPr>
-        <w:t>+BayesianFns\buildGlobalModel.m</w:t>
-      </w:r>
+        <w:t>+</w:t>
+      </w:r>
+      <w:proofErr w:type="spellStart"/>
+      <w:r>
+        <w:rPr>
+          <w:b/>
+          <w:bCs/>
+          <w:lang w:val="en-US"/>
+        </w:rPr>
+        <w:t>BayesianFns</w:t>
+      </w:r>
+      <w:proofErr w:type="spellEnd"/>
+      <w:r>
+        <w:rPr>
+          <w:b/>
+          <w:bCs/>
+          <w:lang w:val="en-US"/>
+        </w:rPr>
+        <w:t>\</w:t>
+      </w:r>
+      <w:proofErr w:type="spellStart"/>
+      <w:r>
+        <w:rPr>
+          <w:b/>
+          <w:bCs/>
+          <w:lang w:val="en-US"/>
+        </w:rPr>
+        <w:t>buildGlobalModel.m</w:t>
+      </w:r>
+      <w:proofErr w:type="spellEnd"/>
     </w:p>
     <w:p>
       <w:pPr>
@@ -1135,7 +1337,21 @@
         <w:rPr>
           <w:lang w:val="en-US"/>
         </w:rPr>
-        <w:t>described in the Methods subsection “Analysis of behavioural responses”</w:t>
+        <w:t xml:space="preserve">described in the Methods subsection “Analysis of </w:t>
+      </w:r>
+      <w:proofErr w:type="spellStart"/>
+      <w:r>
+        <w:rPr>
+          <w:lang w:val="en-US"/>
+        </w:rPr>
+        <w:t>behavioural</w:t>
+      </w:r>
+      <w:proofErr w:type="spellEnd"/>
+      <w:r>
+        <w:rPr>
+          <w:lang w:val="en-US"/>
+        </w:rPr>
+        <w:t xml:space="preserve"> responses”</w:t>
       </w:r>
       <w:r>
         <w:rPr>
@@ -1170,8 +1386,36 @@
           <w:bCs/>
           <w:lang w:val="en-US"/>
         </w:rPr>
-        <w:t>+BayesianFns\estimatePDFSupportArea.m</w:t>
-      </w:r>
+        <w:t>+</w:t>
+      </w:r>
+      <w:proofErr w:type="spellStart"/>
+      <w:r>
+        <w:rPr>
+          <w:b/>
+          <w:bCs/>
+          <w:lang w:val="en-US"/>
+        </w:rPr>
+        <w:t>BayesianFns</w:t>
+      </w:r>
+      <w:proofErr w:type="spellEnd"/>
+      <w:r>
+        <w:rPr>
+          <w:b/>
+          <w:bCs/>
+          <w:lang w:val="en-US"/>
+        </w:rPr>
+        <w:t>\</w:t>
+      </w:r>
+      <w:proofErr w:type="spellStart"/>
+      <w:r>
+        <w:rPr>
+          <w:b/>
+          <w:bCs/>
+          <w:lang w:val="en-US"/>
+        </w:rPr>
+        <w:t>estimatePDFSupportArea.m</w:t>
+      </w:r>
+      <w:proofErr w:type="spellEnd"/>
     </w:p>
     <w:p>
       <w:pPr>
@@ -1285,7 +1529,21 @@
         <w:rPr>
           <w:lang w:val="en-US"/>
         </w:rPr>
-        <w:t>the Methods subsection “Analysis of behavioural responses”</w:t>
+        <w:t xml:space="preserve">the Methods subsection “Analysis of </w:t>
+      </w:r>
+      <w:proofErr w:type="spellStart"/>
+      <w:r>
+        <w:rPr>
+          <w:lang w:val="en-US"/>
+        </w:rPr>
+        <w:t>behavioural</w:t>
+      </w:r>
+      <w:proofErr w:type="spellEnd"/>
+      <w:r>
+        <w:rPr>
+          <w:lang w:val="en-US"/>
+        </w:rPr>
+        <w:t xml:space="preserve"> responses”</w:t>
       </w:r>
       <w:r>
         <w:rPr>
@@ -1320,7 +1578,34 @@
           <w:bCs/>
           <w:lang w:val="en-US"/>
         </w:rPr>
-        <w:t>+BayesianFns\estimate</w:t>
+        <w:t>+</w:t>
+      </w:r>
+      <w:proofErr w:type="spellStart"/>
+      <w:r>
+        <w:rPr>
+          <w:b/>
+          <w:bCs/>
+          <w:lang w:val="en-US"/>
+        </w:rPr>
+        <w:t>BayesianFns</w:t>
+      </w:r>
+      <w:proofErr w:type="spellEnd"/>
+      <w:r>
+        <w:rPr>
+          <w:b/>
+          <w:bCs/>
+          <w:lang w:val="en-US"/>
+        </w:rPr>
+        <w:t>\</w:t>
+      </w:r>
+      <w:proofErr w:type="spellStart"/>
+      <w:r>
+        <w:rPr>
+          <w:b/>
+          <w:bCs/>
+          <w:lang w:val="en-US"/>
+        </w:rPr>
+        <w:t>estimate</w:t>
       </w:r>
       <w:r>
         <w:rPr>
@@ -1330,6 +1615,7 @@
         </w:rPr>
         <w:t>PDFVolume.m</w:t>
       </w:r>
+      <w:proofErr w:type="spellEnd"/>
     </w:p>
     <w:p>
       <w:pPr>
@@ -1371,7 +1657,21 @@
         <w:rPr>
           <w:lang w:val="en-US"/>
         </w:rPr>
-        <w:t>the Methods subsection “Analysis of behavioural responses”</w:t>
+        <w:t xml:space="preserve">the Methods subsection “Analysis of </w:t>
+      </w:r>
+      <w:proofErr w:type="spellStart"/>
+      <w:r>
+        <w:rPr>
+          <w:lang w:val="en-US"/>
+        </w:rPr>
+        <w:t>behavioural</w:t>
+      </w:r>
+      <w:proofErr w:type="spellEnd"/>
+      <w:r>
+        <w:rPr>
+          <w:lang w:val="en-US"/>
+        </w:rPr>
+        <w:t xml:space="preserve"> responses”</w:t>
       </w:r>
       <w:r>
         <w:rPr>
@@ -1400,8 +1700,36 @@
           <w:bCs/>
           <w:lang w:val="en-US"/>
         </w:rPr>
-        <w:t>+BayesianFns\multiModeGauss.m</w:t>
-      </w:r>
+        <w:t>+</w:t>
+      </w:r>
+      <w:proofErr w:type="spellStart"/>
+      <w:r>
+        <w:rPr>
+          <w:b/>
+          <w:bCs/>
+          <w:lang w:val="en-US"/>
+        </w:rPr>
+        <w:t>BayesianFns</w:t>
+      </w:r>
+      <w:proofErr w:type="spellEnd"/>
+      <w:r>
+        <w:rPr>
+          <w:b/>
+          <w:bCs/>
+          <w:lang w:val="en-US"/>
+        </w:rPr>
+        <w:t>\</w:t>
+      </w:r>
+      <w:proofErr w:type="spellStart"/>
+      <w:r>
+        <w:rPr>
+          <w:b/>
+          <w:bCs/>
+          <w:lang w:val="en-US"/>
+        </w:rPr>
+        <w:t>multiModeGauss.m</w:t>
+      </w:r>
+      <w:proofErr w:type="spellEnd"/>
     </w:p>
     <w:p>
       <w:pPr>
@@ -1449,7 +1777,21 @@
         <w:rPr>
           <w:lang w:val="en-US"/>
         </w:rPr>
-        <w:t>the Methods subsection “Analysis of behavioural responses”, in particular equation 13 and the comments within the file.</w:t>
+        <w:t xml:space="preserve">the Methods subsection “Analysis of </w:t>
+      </w:r>
+      <w:proofErr w:type="spellStart"/>
+      <w:r>
+        <w:rPr>
+          <w:lang w:val="en-US"/>
+        </w:rPr>
+        <w:t>behavioural</w:t>
+      </w:r>
+      <w:proofErr w:type="spellEnd"/>
+      <w:r>
+        <w:rPr>
+          <w:lang w:val="en-US"/>
+        </w:rPr>
+        <w:t xml:space="preserve"> responses”, in particular equation 13 and the comments within the file.</w:t>
       </w:r>
     </w:p>
     <w:p>
@@ -1466,8 +1808,36 @@
           <w:bCs/>
           <w:lang w:val="en-US"/>
         </w:rPr>
-        <w:t>+BayesianFns\parArrayFun.m</w:t>
-      </w:r>
+        <w:t>+</w:t>
+      </w:r>
+      <w:proofErr w:type="spellStart"/>
+      <w:r>
+        <w:rPr>
+          <w:b/>
+          <w:bCs/>
+          <w:lang w:val="en-US"/>
+        </w:rPr>
+        <w:t>BayesianFns</w:t>
+      </w:r>
+      <w:proofErr w:type="spellEnd"/>
+      <w:r>
+        <w:rPr>
+          <w:b/>
+          <w:bCs/>
+          <w:lang w:val="en-US"/>
+        </w:rPr>
+        <w:t>\</w:t>
+      </w:r>
+      <w:proofErr w:type="spellStart"/>
+      <w:r>
+        <w:rPr>
+          <w:b/>
+          <w:bCs/>
+          <w:lang w:val="en-US"/>
+        </w:rPr>
+        <w:t>parArrayFun.m</w:t>
+      </w:r>
+      <w:proofErr w:type="spellEnd"/>
     </w:p>
     <w:p>
       <w:pPr>
@@ -1520,8 +1890,36 @@
           <w:bCs/>
           <w:lang w:val="en-US"/>
         </w:rPr>
-        <w:t>+BehaviourFns\getMaxBoutStarts.m</w:t>
-      </w:r>
+        <w:t>+</w:t>
+      </w:r>
+      <w:proofErr w:type="spellStart"/>
+      <w:r>
+        <w:rPr>
+          <w:b/>
+          <w:bCs/>
+          <w:lang w:val="en-US"/>
+        </w:rPr>
+        <w:t>BehaviourFns</w:t>
+      </w:r>
+      <w:proofErr w:type="spellEnd"/>
+      <w:r>
+        <w:rPr>
+          <w:b/>
+          <w:bCs/>
+          <w:lang w:val="en-US"/>
+        </w:rPr>
+        <w:t>\</w:t>
+      </w:r>
+      <w:proofErr w:type="spellStart"/>
+      <w:r>
+        <w:rPr>
+          <w:b/>
+          <w:bCs/>
+          <w:lang w:val="en-US"/>
+        </w:rPr>
+        <w:t>getMaxBoutStarts.m</w:t>
+      </w:r>
+      <w:proofErr w:type="spellEnd"/>
     </w:p>
     <w:p>
       <w:pPr>
@@ -1650,6 +2048,7 @@
           <w:lang w:val="en-US"/>
         </w:rPr>
       </w:pPr>
+      <w:proofErr w:type="spellStart"/>
       <w:r>
         <w:rPr>
           <w:b/>
@@ -1658,6 +2057,7 @@
         </w:rPr>
         <w:t>KC_data.mat</w:t>
       </w:r>
+      <w:proofErr w:type="spellEnd"/>
     </w:p>
     <w:p>
       <w:pPr>
@@ -1665,11 +2065,19 @@
           <w:lang w:val="en-US"/>
         </w:rPr>
       </w:pPr>
-      <w:r>
-        <w:rPr>
-          <w:lang w:val="en-US"/>
-        </w:rPr>
-        <w:t>Matlab file</w:t>
+      <w:proofErr w:type="spellStart"/>
+      <w:r>
+        <w:rPr>
+          <w:lang w:val="en-US"/>
+        </w:rPr>
+        <w:t>Matlab</w:t>
+      </w:r>
+      <w:proofErr w:type="spellEnd"/>
+      <w:r>
+        <w:rPr>
+          <w:lang w:val="en-US"/>
+        </w:rPr>
+        <w:t xml:space="preserve"> file</w:t>
       </w:r>
       <w:r>
         <w:rPr>
@@ -1711,7 +2119,21 @@
         <w:rPr>
           <w:lang w:val="en-US"/>
         </w:rPr>
-        <w:t>recordings in response to 2-second odour pulses</w:t>
+        <w:t xml:space="preserve">recordings in response to 2-second </w:t>
+      </w:r>
+      <w:proofErr w:type="spellStart"/>
+      <w:r>
+        <w:rPr>
+          <w:lang w:val="en-US"/>
+        </w:rPr>
+        <w:t>odour</w:t>
+      </w:r>
+      <w:proofErr w:type="spellEnd"/>
+      <w:r>
+        <w:rPr>
+          <w:lang w:val="en-US"/>
+        </w:rPr>
+        <w:t xml:space="preserve"> pulses</w:t>
       </w:r>
       <w:r>
         <w:rPr>
@@ -1789,7 +2211,35 @@
         <w:rPr>
           <w:lang w:val="en-US"/>
         </w:rPr>
-        <w:t>“lineNames” and “anatomicalNames”</w:t>
+        <w:t>“</w:t>
+      </w:r>
+      <w:proofErr w:type="spellStart"/>
+      <w:r>
+        <w:rPr>
+          <w:lang w:val="en-US"/>
+        </w:rPr>
+        <w:t>lineNames</w:t>
+      </w:r>
+      <w:proofErr w:type="spellEnd"/>
+      <w:r>
+        <w:rPr>
+          <w:lang w:val="en-US"/>
+        </w:rPr>
+        <w:t>” and “</w:t>
+      </w:r>
+      <w:proofErr w:type="spellStart"/>
+      <w:r>
+        <w:rPr>
+          <w:lang w:val="en-US"/>
+        </w:rPr>
+        <w:t>anatomicalNames</w:t>
+      </w:r>
+      <w:proofErr w:type="spellEnd"/>
+      <w:r>
+        <w:rPr>
+          <w:lang w:val="en-US"/>
+        </w:rPr>
+        <w:t>”</w:t>
       </w:r>
       <w:r>
         <w:rPr>
@@ -1825,7 +2275,14 @@
         <w:rPr>
           <w:lang w:val="en-US"/>
         </w:rPr>
-        <w:t>. The second element indexes the odo</w:t>
+        <w:t xml:space="preserve">. The second element indexes the </w:t>
+      </w:r>
+      <w:proofErr w:type="spellStart"/>
+      <w:r>
+        <w:rPr>
+          <w:lang w:val="en-US"/>
+        </w:rPr>
+        <w:t>odo</w:t>
       </w:r>
       <w:r>
         <w:rPr>
@@ -1837,7 +2294,14 @@
         <w:rPr>
           <w:lang w:val="en-US"/>
         </w:rPr>
-        <w:t>r (tabulated below). The third element indexes the</w:t>
+        <w:t>r</w:t>
+      </w:r>
+      <w:proofErr w:type="spellEnd"/>
+      <w:r>
+        <w:rPr>
+          <w:lang w:val="en-US"/>
+        </w:rPr>
+        <w:t xml:space="preserve"> (tabulated below). The third element indexes the</w:t>
       </w:r>
       <w:r>
         <w:rPr>
@@ -1851,11 +2315,19 @@
         </w:rPr>
         <w:t xml:space="preserve"> </w:t>
       </w:r>
-      <w:r>
-        <w:rPr>
-          <w:lang w:val="en-US"/>
-        </w:rPr>
-        <w:t>odour presentation</w:t>
+      <w:proofErr w:type="spellStart"/>
+      <w:r>
+        <w:rPr>
+          <w:lang w:val="en-US"/>
+        </w:rPr>
+        <w:t>odour</w:t>
+      </w:r>
+      <w:proofErr w:type="spellEnd"/>
+      <w:r>
+        <w:rPr>
+          <w:lang w:val="en-US"/>
+        </w:rPr>
+        <w:t xml:space="preserve"> presentation</w:t>
       </w:r>
       <w:r>
         <w:rPr>
@@ -2030,9 +2502,11 @@
                 <w:lang w:val="en-US"/>
               </w:rPr>
             </w:pPr>
+            <w:proofErr w:type="spellStart"/>
             <w:r>
               <w:t>sulcatone</w:t>
             </w:r>
+            <w:proofErr w:type="spellEnd"/>
           </w:p>
         </w:tc>
       </w:tr>
@@ -2368,17 +2842,39 @@
         </w:rPr>
         <w:t>“</w:t>
       </w:r>
-      <w:r>
-        <w:rPr>
-          <w:lang w:val="en-US"/>
-        </w:rPr>
-        <w:t xml:space="preserve">odourOn” and </w:t>
-      </w:r>
-      <w:r>
-        <w:rPr>
-          <w:lang w:val="en-US"/>
-        </w:rPr>
-        <w:t xml:space="preserve">“odourOff” contain the spikes occurring </w:t>
+      <w:proofErr w:type="spellStart"/>
+      <w:r>
+        <w:rPr>
+          <w:lang w:val="en-US"/>
+        </w:rPr>
+        <w:t>odourOn</w:t>
+      </w:r>
+      <w:proofErr w:type="spellEnd"/>
+      <w:r>
+        <w:rPr>
+          <w:lang w:val="en-US"/>
+        </w:rPr>
+        <w:t xml:space="preserve">” and </w:t>
+      </w:r>
+      <w:r>
+        <w:rPr>
+          <w:lang w:val="en-US"/>
+        </w:rPr>
+        <w:t>“</w:t>
+      </w:r>
+      <w:proofErr w:type="spellStart"/>
+      <w:r>
+        <w:rPr>
+          <w:lang w:val="en-US"/>
+        </w:rPr>
+        <w:t>odourOff</w:t>
+      </w:r>
+      <w:proofErr w:type="spellEnd"/>
+      <w:r>
+        <w:rPr>
+          <w:lang w:val="en-US"/>
+        </w:rPr>
+        <w:t xml:space="preserve">” contain the spikes occurring </w:t>
       </w:r>
       <w:r>
         <w:rPr>
@@ -2542,11 +3038,19 @@
         </w:rPr>
         <w:t>“</w:t>
       </w:r>
-      <w:r>
-        <w:rPr>
-          <w:lang w:val="en-US"/>
-        </w:rPr>
-        <w:t xml:space="preserve">stimComplete” </w:t>
+      <w:proofErr w:type="spellStart"/>
+      <w:r>
+        <w:rPr>
+          <w:lang w:val="en-US"/>
+        </w:rPr>
+        <w:t>stimComplete</w:t>
+      </w:r>
+      <w:proofErr w:type="spellEnd"/>
+      <w:r>
+        <w:rPr>
+          <w:lang w:val="en-US"/>
+        </w:rPr>
+        <w:t xml:space="preserve">” </w:t>
       </w:r>
       <w:r>
         <w:rPr>
@@ -2576,7 +3080,21 @@
         <w:rPr>
           <w:lang w:val="en-US"/>
         </w:rPr>
-        <w:t>ese are the rasters used for the temporal classification.</w:t>
+        <w:t xml:space="preserve">ese are the </w:t>
+      </w:r>
+      <w:proofErr w:type="spellStart"/>
+      <w:r>
+        <w:rPr>
+          <w:lang w:val="en-US"/>
+        </w:rPr>
+        <w:t>rasters</w:t>
+      </w:r>
+      <w:proofErr w:type="spellEnd"/>
+      <w:r>
+        <w:rPr>
+          <w:lang w:val="en-US"/>
+        </w:rPr>
+        <w:t xml:space="preserve"> used for the temporal classification.</w:t>
       </w:r>
     </w:p>
     <w:p>
@@ -2594,7 +3112,43 @@
         <w:rPr>
           <w:lang w:val="en-US"/>
         </w:rPr>
-        <w:t xml:space="preserve">“on_significant” and “off_significant” contain </w:t>
+        <w:t>“</w:t>
+      </w:r>
+      <w:proofErr w:type="spellStart"/>
+      <w:proofErr w:type="gramStart"/>
+      <w:r>
+        <w:rPr>
+          <w:lang w:val="en-US"/>
+        </w:rPr>
+        <w:t>on</w:t>
+      </w:r>
+      <w:proofErr w:type="gramEnd"/>
+      <w:r>
+        <w:rPr>
+          <w:lang w:val="en-US"/>
+        </w:rPr>
+        <w:t>_significant</w:t>
+      </w:r>
+      <w:proofErr w:type="spellEnd"/>
+      <w:r>
+        <w:rPr>
+          <w:lang w:val="en-US"/>
+        </w:rPr>
+        <w:t>” and “</w:t>
+      </w:r>
+      <w:proofErr w:type="spellStart"/>
+      <w:r>
+        <w:rPr>
+          <w:lang w:val="en-US"/>
+        </w:rPr>
+        <w:t>off_significant</w:t>
+      </w:r>
+      <w:proofErr w:type="spellEnd"/>
+      <w:r>
+        <w:rPr>
+          <w:lang w:val="en-US"/>
+        </w:rPr>
+        <w:t xml:space="preserve">” contain </w:t>
       </w:r>
       <w:r>
         <w:rPr>
@@ -2636,7 +3190,21 @@
         <w:rPr>
           <w:lang w:val="en-US"/>
         </w:rPr>
-        <w:t>of a cell-odour response have the same value.</w:t>
+        <w:t>of a cell-</w:t>
+      </w:r>
+      <w:proofErr w:type="spellStart"/>
+      <w:r>
+        <w:rPr>
+          <w:lang w:val="en-US"/>
+        </w:rPr>
+        <w:t>odour</w:t>
+      </w:r>
+      <w:proofErr w:type="spellEnd"/>
+      <w:r>
+        <w:rPr>
+          <w:lang w:val="en-US"/>
+        </w:rPr>
+        <w:t xml:space="preserve"> response have the same value.</w:t>
       </w:r>
     </w:p>
     <w:p>
@@ -2668,7 +3236,21 @@
         <w:rPr>
           <w:lang w:val="en-US"/>
         </w:rPr>
-        <w:t>Similar to the file “KC_data.mat” described above</w:t>
+        <w:t>Similar to the file “</w:t>
+      </w:r>
+      <w:proofErr w:type="spellStart"/>
+      <w:r>
+        <w:rPr>
+          <w:lang w:val="en-US"/>
+        </w:rPr>
+        <w:t>KC_data.mat</w:t>
+      </w:r>
+      <w:proofErr w:type="spellEnd"/>
+      <w:r>
+        <w:rPr>
+          <w:lang w:val="en-US"/>
+        </w:rPr>
+        <w:t>” described above</w:t>
       </w:r>
       <w:r>
         <w:rPr>
@@ -2750,7 +3332,21 @@
         <w:rPr>
           <w:lang w:val="en-US"/>
         </w:rPr>
-        <w:t xml:space="preserve"> 10s odour presentations</w:t>
+        <w:t xml:space="preserve"> 10s </w:t>
+      </w:r>
+      <w:proofErr w:type="spellStart"/>
+      <w:r>
+        <w:rPr>
+          <w:lang w:val="en-US"/>
+        </w:rPr>
+        <w:t>odour</w:t>
+      </w:r>
+      <w:proofErr w:type="spellEnd"/>
+      <w:r>
+        <w:rPr>
+          <w:lang w:val="en-US"/>
+        </w:rPr>
+        <w:t xml:space="preserve"> presentations</w:t>
       </w:r>
       <w:r>
         <w:rPr>
@@ -2780,7 +3376,21 @@
         <w:rPr>
           <w:lang w:val="en-US"/>
         </w:rPr>
-        <w:t xml:space="preserve">analysis was performed only between odour pulse onset and offset (i.e. not after the offset). </w:t>
+        <w:t xml:space="preserve">analysis was performed only between </w:t>
+      </w:r>
+      <w:proofErr w:type="spellStart"/>
+      <w:r>
+        <w:rPr>
+          <w:lang w:val="en-US"/>
+        </w:rPr>
+        <w:t>odour</w:t>
+      </w:r>
+      <w:proofErr w:type="spellEnd"/>
+      <w:r>
+        <w:rPr>
+          <w:lang w:val="en-US"/>
+        </w:rPr>
+        <w:t xml:space="preserve"> pulse onset and offset (i.e. not after the offset). </w:t>
       </w:r>
       <w:r>
         <w:rPr>
@@ -2792,13 +3402,41 @@
         <w:rPr>
           <w:lang w:val="en-US"/>
         </w:rPr>
-        <w:t xml:space="preserve">he “odourOff” </w:t>
-      </w:r>
-      <w:r>
-        <w:rPr>
-          <w:lang w:val="en-US"/>
-        </w:rPr>
-        <w:t>and “off_significant” variables are not included</w:t>
+        <w:t>he “</w:t>
+      </w:r>
+      <w:proofErr w:type="spellStart"/>
+      <w:r>
+        <w:rPr>
+          <w:lang w:val="en-US"/>
+        </w:rPr>
+        <w:t>odourOff</w:t>
+      </w:r>
+      <w:proofErr w:type="spellEnd"/>
+      <w:r>
+        <w:rPr>
+          <w:lang w:val="en-US"/>
+        </w:rPr>
+        <w:t xml:space="preserve">” </w:t>
+      </w:r>
+      <w:r>
+        <w:rPr>
+          <w:lang w:val="en-US"/>
+        </w:rPr>
+        <w:t>and “</w:t>
+      </w:r>
+      <w:proofErr w:type="spellStart"/>
+      <w:r>
+        <w:rPr>
+          <w:lang w:val="en-US"/>
+        </w:rPr>
+        <w:t>off_significant</w:t>
+      </w:r>
+      <w:proofErr w:type="spellEnd"/>
+      <w:r>
+        <w:rPr>
+          <w:lang w:val="en-US"/>
+        </w:rPr>
+        <w:t>” variables are not included</w:t>
       </w:r>
       <w:r>
         <w:rPr>
@@ -2810,7 +3448,21 @@
         <w:rPr>
           <w:lang w:val="en-US"/>
         </w:rPr>
-        <w:t xml:space="preserve">“stimComplete” </w:t>
+        <w:t>“</w:t>
+      </w:r>
+      <w:proofErr w:type="spellStart"/>
+      <w:r>
+        <w:rPr>
+          <w:lang w:val="en-US"/>
+        </w:rPr>
+        <w:t>stimComplete</w:t>
+      </w:r>
+      <w:proofErr w:type="spellEnd"/>
+      <w:r>
+        <w:rPr>
+          <w:lang w:val="en-US"/>
+        </w:rPr>
+        <w:t xml:space="preserve">” </w:t>
       </w:r>
       <w:r>
         <w:rPr>
@@ -2822,7 +3474,21 @@
         <w:rPr>
           <w:lang w:val="en-US"/>
         </w:rPr>
-        <w:t>s also been removed because it is identical to “odourOn.”</w:t>
+        <w:t>s also been removed because it is identical to “</w:t>
+      </w:r>
+      <w:proofErr w:type="spellStart"/>
+      <w:r>
+        <w:rPr>
+          <w:lang w:val="en-US"/>
+        </w:rPr>
+        <w:t>odourOn</w:t>
+      </w:r>
+      <w:proofErr w:type="spellEnd"/>
+      <w:r>
+        <w:rPr>
+          <w:lang w:val="en-US"/>
+        </w:rPr>
+        <w:t>.”</w:t>
       </w:r>
       <w:r>
         <w:rPr>
@@ -2841,6 +3507,7 @@
           <w:lang w:val="en-US"/>
         </w:rPr>
       </w:pPr>
+      <w:proofErr w:type="spellStart"/>
       <w:r>
         <w:rPr>
           <w:b/>
@@ -2865,6 +3532,7 @@
         </w:rPr>
         <w:t>.mat</w:t>
       </w:r>
+      <w:proofErr w:type="spellEnd"/>
     </w:p>
     <w:p>
       <w:pPr>
@@ -2872,11 +3540,33 @@
           <w:lang w:val="en-US"/>
         </w:rPr>
       </w:pPr>
-      <w:r>
-        <w:rPr>
-          <w:lang w:val="en-US"/>
-        </w:rPr>
-        <w:t xml:space="preserve">Matlab file with data from the behaviour experiments (figure 5 and extended 3). </w:t>
+      <w:proofErr w:type="spellStart"/>
+      <w:r>
+        <w:rPr>
+          <w:lang w:val="en-US"/>
+        </w:rPr>
+        <w:t>Matlab</w:t>
+      </w:r>
+      <w:proofErr w:type="spellEnd"/>
+      <w:r>
+        <w:rPr>
+          <w:lang w:val="en-US"/>
+        </w:rPr>
+        <w:t xml:space="preserve"> file with data from the </w:t>
+      </w:r>
+      <w:proofErr w:type="spellStart"/>
+      <w:r>
+        <w:rPr>
+          <w:lang w:val="en-US"/>
+        </w:rPr>
+        <w:t>behaviour</w:t>
+      </w:r>
+      <w:proofErr w:type="spellEnd"/>
+      <w:r>
+        <w:rPr>
+          <w:lang w:val="en-US"/>
+        </w:rPr>
+        <w:t xml:space="preserve"> experiments (figure 5 and extended 3). </w:t>
       </w:r>
       <w:r>
         <w:rPr>
@@ -2888,7 +3578,21 @@
         <w:rPr>
           <w:lang w:val="en-US"/>
         </w:rPr>
-        <w:t xml:space="preserve">ontains two structs: “DANData” contains data acquired from the flies carrying the </w:t>
+        <w:t>ontains two structs: “</w:t>
+      </w:r>
+      <w:proofErr w:type="spellStart"/>
+      <w:r>
+        <w:rPr>
+          <w:lang w:val="en-US"/>
+        </w:rPr>
+        <w:t>DANData</w:t>
+      </w:r>
+      <w:proofErr w:type="spellEnd"/>
+      <w:r>
+        <w:rPr>
+          <w:lang w:val="en-US"/>
+        </w:rPr>
+        <w:t xml:space="preserve">” contains data acquired from the flies carrying the </w:t>
       </w:r>
       <w:r>
         <w:rPr>
@@ -2902,7 +3606,21 @@
         <w:rPr>
           <w:lang w:val="en-US"/>
         </w:rPr>
-        <w:t xml:space="preserve"> driver and trained with optical stimulation; “ChrCtrlData” contains data acquired from flies carrying the undriven </w:t>
+        <w:t xml:space="preserve"> driver and trained with optical stimulation; “</w:t>
+      </w:r>
+      <w:proofErr w:type="spellStart"/>
+      <w:r>
+        <w:rPr>
+          <w:lang w:val="en-US"/>
+        </w:rPr>
+        <w:t>ChrCtrlData</w:t>
+      </w:r>
+      <w:proofErr w:type="spellEnd"/>
+      <w:r>
+        <w:rPr>
+          <w:lang w:val="en-US"/>
+        </w:rPr>
+        <w:t xml:space="preserve">” contains data acquired from flies carrying the undriven </w:t>
       </w:r>
       <w:r>
         <w:rPr>
@@ -2910,13 +3628,37 @@
           <w:iCs/>
           <w:lang w:val="en-US"/>
         </w:rPr>
-        <w:t>UAS-CsChrimson</w:t>
-      </w:r>
-      <w:r>
-        <w:rPr>
-          <w:lang w:val="en-US"/>
-        </w:rPr>
-        <w:t xml:space="preserve"> transgene and presented with the same optical training protocol as those in the “DANData” group.</w:t>
+        <w:t>UAS-</w:t>
+      </w:r>
+      <w:proofErr w:type="spellStart"/>
+      <w:r>
+        <w:rPr>
+          <w:i/>
+          <w:iCs/>
+          <w:lang w:val="en-US"/>
+        </w:rPr>
+        <w:t>CsChrimson</w:t>
+      </w:r>
+      <w:proofErr w:type="spellEnd"/>
+      <w:r>
+        <w:rPr>
+          <w:lang w:val="en-US"/>
+        </w:rPr>
+        <w:t xml:space="preserve"> transgene and presented with the same optical training protocol as those in the “</w:t>
+      </w:r>
+      <w:proofErr w:type="spellStart"/>
+      <w:r>
+        <w:rPr>
+          <w:lang w:val="en-US"/>
+        </w:rPr>
+        <w:t>DANData</w:t>
+      </w:r>
+      <w:proofErr w:type="spellEnd"/>
+      <w:r>
+        <w:rPr>
+          <w:lang w:val="en-US"/>
+        </w:rPr>
+        <w:t>” group.</w:t>
       </w:r>
     </w:p>
     <w:p>
@@ -2947,7 +3689,21 @@
         <w:rPr>
           <w:lang w:val="en-US"/>
         </w:rPr>
-        <w:t>“framePeriod”: the time in seconds between camera acquisition frames.</w:t>
+        <w:t>“</w:t>
+      </w:r>
+      <w:proofErr w:type="spellStart"/>
+      <w:r>
+        <w:rPr>
+          <w:lang w:val="en-US"/>
+        </w:rPr>
+        <w:t>framePeriod</w:t>
+      </w:r>
+      <w:proofErr w:type="spellEnd"/>
+      <w:r>
+        <w:rPr>
+          <w:lang w:val="en-US"/>
+        </w:rPr>
+        <w:t>”: the time in seconds between camera acquisition frames.</w:t>
       </w:r>
     </w:p>
     <w:p>
@@ -2965,7 +3721,21 @@
         <w:rPr>
           <w:lang w:val="en-US"/>
         </w:rPr>
-        <w:t>“times”: the time points of camera frames in seconds, aligned to the odour onset.</w:t>
+        <w:t xml:space="preserve">“times”: the time points of camera frames in seconds, aligned to the </w:t>
+      </w:r>
+      <w:proofErr w:type="spellStart"/>
+      <w:r>
+        <w:rPr>
+          <w:lang w:val="en-US"/>
+        </w:rPr>
+        <w:t>odour</w:t>
+      </w:r>
+      <w:proofErr w:type="spellEnd"/>
+      <w:r>
+        <w:rPr>
+          <w:lang w:val="en-US"/>
+        </w:rPr>
+        <w:t xml:space="preserve"> onset.</w:t>
       </w:r>
     </w:p>
     <w:p>
@@ -2983,7 +3753,21 @@
         <w:rPr>
           <w:lang w:val="en-US"/>
         </w:rPr>
-        <w:t>“movtMagnitude”: a 3-by-N</w:t>
+        <w:t>“</w:t>
+      </w:r>
+      <w:proofErr w:type="spellStart"/>
+      <w:r>
+        <w:rPr>
+          <w:lang w:val="en-US"/>
+        </w:rPr>
+        <w:t>movtMagnitude</w:t>
+      </w:r>
+      <w:proofErr w:type="spellEnd"/>
+      <w:r>
+        <w:rPr>
+          <w:lang w:val="en-US"/>
+        </w:rPr>
+        <w:t>”: a 3-by-N</w:t>
       </w:r>
       <w:r>
         <w:rPr>
@@ -3035,14 +3819,70 @@
         <w:rPr>
           <w:lang w:val="en-US"/>
         </w:rPr>
-        <w:t xml:space="preserve">in radians). The data here represents the raw ball movement, i.e. including the non-locomotion events (e.g. grooming and flicking the ball). The first dimension indexes the three odours: 1) with </w:t>
+        <w:t xml:space="preserve">in radians). The data here represents the raw ball movement, i.e. including the non-locomotion events (e.g. grooming and flicking the ball). The </w:t>
+      </w:r>
+      <w:proofErr w:type="gramStart"/>
+      <w:r>
+        <w:rPr>
+          <w:lang w:val="en-US"/>
+        </w:rPr>
+        <w:t>first dimension</w:t>
+      </w:r>
+      <w:proofErr w:type="gramEnd"/>
+      <w:r>
+        <w:rPr>
+          <w:lang w:val="en-US"/>
+        </w:rPr>
+        <w:t xml:space="preserve"> indexes the three </w:t>
+      </w:r>
+      <w:proofErr w:type="spellStart"/>
+      <w:r>
+        <w:rPr>
+          <w:lang w:val="en-US"/>
+        </w:rPr>
+        <w:t>odours</w:t>
+      </w:r>
+      <w:proofErr w:type="spellEnd"/>
+      <w:r>
+        <w:rPr>
+          <w:lang w:val="en-US"/>
+        </w:rPr>
+        <w:t xml:space="preserve">: 1) with </w:t>
       </w:r>
       <w:r>
         <w:rPr>
           <w:lang w:val="en-US"/>
         </w:rPr>
         <w:lastRenderedPageBreak/>
-        <w:t>reinforcement during the early time window (3 – 4 seconds), (2) with reinforcement during the late time window (7 – 8 seconds), and (3) with no reinforcement. The second dimension indexes fly identity. The third dimension indexes time.</w:t>
+        <w:t xml:space="preserve">reinforcement during the early time window (3 – 4 seconds), (2) with reinforcement during the late time window (7 – 8 seconds), and (3) with no reinforcement. The </w:t>
+      </w:r>
+      <w:proofErr w:type="gramStart"/>
+      <w:r>
+        <w:rPr>
+          <w:lang w:val="en-US"/>
+        </w:rPr>
+        <w:t>second dimension</w:t>
+      </w:r>
+      <w:proofErr w:type="gramEnd"/>
+      <w:r>
+        <w:rPr>
+          <w:lang w:val="en-US"/>
+        </w:rPr>
+        <w:t xml:space="preserve"> indexes fly identity. The </w:t>
+      </w:r>
+      <w:proofErr w:type="gramStart"/>
+      <w:r>
+        <w:rPr>
+          <w:lang w:val="en-US"/>
+        </w:rPr>
+        <w:t>third dimension</w:t>
+      </w:r>
+      <w:proofErr w:type="gramEnd"/>
+      <w:r>
+        <w:rPr>
+          <w:lang w:val="en-US"/>
+        </w:rPr>
+        <w:t xml:space="preserve"> indexes time.</w:t>
       </w:r>
     </w:p>
     <w:p>
@@ -3060,20 +3900,107 @@
         <w:rPr>
           <w:lang w:val="en-US"/>
         </w:rPr>
-        <w:t>“sortOrder”: the sorting order of the flies for the top panels of figure 5a. The sorting is performed according to the initiation time of the most vigorous movement bout as described in the publication and reproduced in the file “script_behaviour_getStartTimes.m”. The element (i,j) contains the fly identity of the j</w:t>
+        <w:t>“</w:t>
+      </w:r>
+      <w:proofErr w:type="spellStart"/>
+      <w:r>
+        <w:rPr>
+          <w:lang w:val="en-US"/>
+        </w:rPr>
+        <w:t>sortOrder</w:t>
+      </w:r>
+      <w:proofErr w:type="spellEnd"/>
+      <w:r>
+        <w:rPr>
+          <w:lang w:val="en-US"/>
+        </w:rPr>
+        <w:t>”: the sorting order of the flies for the top panels of figure 5a. The sorting is performed according to the initiation time of the most vigorous movement bout as described in the publication and reproduced in the file “</w:t>
+      </w:r>
+      <w:proofErr w:type="spellStart"/>
+      <w:r>
+        <w:rPr>
+          <w:lang w:val="en-US"/>
+        </w:rPr>
+        <w:t>script_behaviour_getStartTimes.m</w:t>
+      </w:r>
+      <w:proofErr w:type="spellEnd"/>
+      <w:r>
+        <w:rPr>
+          <w:lang w:val="en-US"/>
+        </w:rPr>
+        <w:t>”. The element (</w:t>
+      </w:r>
+      <w:proofErr w:type="spellStart"/>
+      <w:proofErr w:type="gramStart"/>
+      <w:r>
+        <w:rPr>
+          <w:lang w:val="en-US"/>
+        </w:rPr>
+        <w:t>i,j</w:t>
+      </w:r>
+      <w:proofErr w:type="spellEnd"/>
+      <w:proofErr w:type="gramEnd"/>
+      <w:r>
+        <w:rPr>
+          <w:lang w:val="en-US"/>
+        </w:rPr>
+        <w:t xml:space="preserve">) contains the fly identity of the </w:t>
+      </w:r>
+      <w:proofErr w:type="spellStart"/>
+      <w:r>
+        <w:rPr>
+          <w:lang w:val="en-US"/>
+        </w:rPr>
+        <w:t>j</w:t>
       </w:r>
       <w:r>
         <w:rPr>
           <w:vertAlign w:val="superscript"/>
           <w:lang w:val="en-US"/>
         </w:rPr>
-        <w:t xml:space="preserve">th </w:t>
-      </w:r>
-      <w:r>
-        <w:rPr>
-          <w:lang w:val="en-US"/>
-        </w:rPr>
-        <w:t>earliest mover when presented with odour i.</w:t>
+        <w:t>th</w:t>
+      </w:r>
+      <w:proofErr w:type="spellEnd"/>
+      <w:r>
+        <w:rPr>
+          <w:vertAlign w:val="superscript"/>
+          <w:lang w:val="en-US"/>
+        </w:rPr>
+        <w:t xml:space="preserve"> </w:t>
+      </w:r>
+      <w:r>
+        <w:rPr>
+          <w:lang w:val="en-US"/>
+        </w:rPr>
+        <w:t xml:space="preserve">earliest mover when presented with </w:t>
+      </w:r>
+      <w:proofErr w:type="spellStart"/>
+      <w:r>
+        <w:rPr>
+          <w:lang w:val="en-US"/>
+        </w:rPr>
+        <w:t>odour</w:t>
+      </w:r>
+      <w:proofErr w:type="spellEnd"/>
+      <w:r>
+        <w:rPr>
+          <w:lang w:val="en-US"/>
+        </w:rPr>
+        <w:t xml:space="preserve"> </w:t>
+      </w:r>
+      <w:proofErr w:type="spellStart"/>
+      <w:r>
+        <w:rPr>
+          <w:lang w:val="en-US"/>
+        </w:rPr>
+        <w:t>i</w:t>
+      </w:r>
+      <w:proofErr w:type="spellEnd"/>
+      <w:r>
+        <w:rPr>
+          <w:lang w:val="en-US"/>
+        </w:rPr>
+        <w:t>.</w:t>
       </w:r>
     </w:p>
     <w:p>
@@ -3091,20 +4018,93 @@
         <w:rPr>
           <w:lang w:val="en-US"/>
         </w:rPr>
-        <w:t>“sortedTimes”: the time points of movement initiation. Element (i,j) contains the movement initiation time of the j</w:t>
+        <w:t>“</w:t>
+      </w:r>
+      <w:proofErr w:type="spellStart"/>
+      <w:r>
+        <w:rPr>
+          <w:lang w:val="en-US"/>
+        </w:rPr>
+        <w:t>sortedTimes</w:t>
+      </w:r>
+      <w:proofErr w:type="spellEnd"/>
+      <w:r>
+        <w:rPr>
+          <w:lang w:val="en-US"/>
+        </w:rPr>
+        <w:t>”: the time points of movement initiation. Element (</w:t>
+      </w:r>
+      <w:proofErr w:type="spellStart"/>
+      <w:proofErr w:type="gramStart"/>
+      <w:r>
+        <w:rPr>
+          <w:lang w:val="en-US"/>
+        </w:rPr>
+        <w:t>i,j</w:t>
+      </w:r>
+      <w:proofErr w:type="spellEnd"/>
+      <w:proofErr w:type="gramEnd"/>
+      <w:r>
+        <w:rPr>
+          <w:lang w:val="en-US"/>
+        </w:rPr>
+        <w:t xml:space="preserve">) contains the movement initiation time of the </w:t>
+      </w:r>
+      <w:proofErr w:type="spellStart"/>
+      <w:r>
+        <w:rPr>
+          <w:lang w:val="en-US"/>
+        </w:rPr>
+        <w:t>j</w:t>
       </w:r>
       <w:r>
         <w:rPr>
           <w:vertAlign w:val="superscript"/>
           <w:lang w:val="en-US"/>
         </w:rPr>
-        <w:t xml:space="preserve">th </w:t>
-      </w:r>
-      <w:r>
-        <w:rPr>
-          <w:lang w:val="en-US"/>
-        </w:rPr>
-        <w:t>earliest mover when presented with odour i.</w:t>
+        <w:t>th</w:t>
+      </w:r>
+      <w:proofErr w:type="spellEnd"/>
+      <w:r>
+        <w:rPr>
+          <w:vertAlign w:val="superscript"/>
+          <w:lang w:val="en-US"/>
+        </w:rPr>
+        <w:t xml:space="preserve"> </w:t>
+      </w:r>
+      <w:r>
+        <w:rPr>
+          <w:lang w:val="en-US"/>
+        </w:rPr>
+        <w:t xml:space="preserve">earliest mover when presented with </w:t>
+      </w:r>
+      <w:proofErr w:type="spellStart"/>
+      <w:r>
+        <w:rPr>
+          <w:lang w:val="en-US"/>
+        </w:rPr>
+        <w:t>odour</w:t>
+      </w:r>
+      <w:proofErr w:type="spellEnd"/>
+      <w:r>
+        <w:rPr>
+          <w:lang w:val="en-US"/>
+        </w:rPr>
+        <w:t xml:space="preserve"> </w:t>
+      </w:r>
+      <w:proofErr w:type="spellStart"/>
+      <w:r>
+        <w:rPr>
+          <w:lang w:val="en-US"/>
+        </w:rPr>
+        <w:t>i</w:t>
+      </w:r>
+      <w:proofErr w:type="spellEnd"/>
+      <w:r>
+        <w:rPr>
+          <w:lang w:val="en-US"/>
+        </w:rPr>
+        <w:t>.</w:t>
       </w:r>
     </w:p>
     <w:p>
@@ -3122,7 +4122,21 @@
         <w:rPr>
           <w:lang w:val="en-US"/>
         </w:rPr>
-        <w:t>“movtHistTimeScale”: the x-axis of the smoothed movement initiation histograms shown in the lower panels of figure 5a and extended 3b.</w:t>
+        <w:t>“</w:t>
+      </w:r>
+      <w:proofErr w:type="spellStart"/>
+      <w:r>
+        <w:rPr>
+          <w:lang w:val="en-US"/>
+        </w:rPr>
+        <w:t>movtHistTimeScale</w:t>
+      </w:r>
+      <w:proofErr w:type="spellEnd"/>
+      <w:r>
+        <w:rPr>
+          <w:lang w:val="en-US"/>
+        </w:rPr>
+        <w:t>”: the x-axis of the smoothed movement initiation histograms shown in the lower panels of figure 5a and extended 3b.</w:t>
       </w:r>
     </w:p>
     <w:p>
@@ -3140,7 +4154,49 @@
         <w:rPr>
           <w:lang w:val="en-US"/>
         </w:rPr>
-        <w:t>“movtHistInit”: the movement initiation histograms shown in lower panels of figure 5a and extended 3b. The first dimension indexes over odour.</w:t>
+        <w:t>“</w:t>
+      </w:r>
+      <w:proofErr w:type="spellStart"/>
+      <w:r>
+        <w:rPr>
+          <w:lang w:val="en-US"/>
+        </w:rPr>
+        <w:t>movtHistInit</w:t>
+      </w:r>
+      <w:proofErr w:type="spellEnd"/>
+      <w:r>
+        <w:rPr>
+          <w:lang w:val="en-US"/>
+        </w:rPr>
+        <w:t xml:space="preserve">”: the movement initiation histograms shown in lower panels of figure 5a and extended 3b. The </w:t>
+      </w:r>
+      <w:proofErr w:type="gramStart"/>
+      <w:r>
+        <w:rPr>
+          <w:lang w:val="en-US"/>
+        </w:rPr>
+        <w:t>first dimension</w:t>
+      </w:r>
+      <w:proofErr w:type="gramEnd"/>
+      <w:r>
+        <w:rPr>
+          <w:lang w:val="en-US"/>
+        </w:rPr>
+        <w:t xml:space="preserve"> indexes over </w:t>
+      </w:r>
+      <w:proofErr w:type="spellStart"/>
+      <w:r>
+        <w:rPr>
+          <w:lang w:val="en-US"/>
+        </w:rPr>
+        <w:t>odour</w:t>
+      </w:r>
+      <w:proofErr w:type="spellEnd"/>
+      <w:r>
+        <w:rPr>
+          <w:lang w:val="en-US"/>
+        </w:rPr>
+        <w:t>.</w:t>
       </w:r>
     </w:p>
     <w:p>
@@ -3158,6 +4214,7 @@
           <w:lang w:val="en-US"/>
         </w:rPr>
       </w:pPr>
+      <w:proofErr w:type="spellStart"/>
       <w:r>
         <w:rPr>
           <w:b/>
@@ -3166,6 +4223,7 @@
         </w:rPr>
         <w:t>MBON_data.mat</w:t>
       </w:r>
+      <w:proofErr w:type="spellEnd"/>
     </w:p>
     <w:p>
       <w:pPr>
@@ -3173,11 +4231,19 @@
           <w:lang w:val="en-US"/>
         </w:rPr>
       </w:pPr>
-      <w:r>
-        <w:rPr>
-          <w:lang w:val="en-US"/>
-        </w:rPr>
-        <w:t xml:space="preserve">Matlab file containing the </w:t>
+      <w:proofErr w:type="spellStart"/>
+      <w:r>
+        <w:rPr>
+          <w:lang w:val="en-US"/>
+        </w:rPr>
+        <w:t>Matlab</w:t>
+      </w:r>
+      <w:proofErr w:type="spellEnd"/>
+      <w:r>
+        <w:rPr>
+          <w:lang w:val="en-US"/>
+        </w:rPr>
+        <w:t xml:space="preserve"> file containing the </w:t>
       </w:r>
       <w:r>
         <w:rPr>
@@ -3237,7 +4303,14 @@
         <w:rPr>
           <w:lang w:val="en-US"/>
         </w:rPr>
-        <w:t>“MBON_spikeT</w:t>
+        <w:t>“</w:t>
+      </w:r>
+      <w:proofErr w:type="spellStart"/>
+      <w:r>
+        <w:rPr>
+          <w:lang w:val="en-US"/>
+        </w:rPr>
+        <w:t>MBON_spikeT</w:t>
       </w:r>
       <w:r>
         <w:rPr>
@@ -3245,6 +4318,7 @@
         </w:rPr>
         <w:t>imes</w:t>
       </w:r>
+      <w:proofErr w:type="spellEnd"/>
       <w:r>
         <w:rPr>
           <w:lang w:val="en-US"/>
@@ -3255,7 +4329,21 @@
         <w:rPr>
           <w:lang w:val="en-US"/>
         </w:rPr>
-        <w:t xml:space="preserve"> The rows of the array correspond to the four odour presentations: </w:t>
+        <w:t xml:space="preserve"> The rows of the array correspond to the four </w:t>
+      </w:r>
+      <w:proofErr w:type="spellStart"/>
+      <w:r>
+        <w:rPr>
+          <w:lang w:val="en-US"/>
+        </w:rPr>
+        <w:t>odour</w:t>
+      </w:r>
+      <w:proofErr w:type="spellEnd"/>
+      <w:r>
+        <w:rPr>
+          <w:lang w:val="en-US"/>
+        </w:rPr>
+        <w:t xml:space="preserve"> presentations: </w:t>
       </w:r>
       <w:r>
         <w:rPr>
@@ -3309,7 +4397,14 @@
         <w:rPr>
           <w:lang w:val="en-US"/>
         </w:rPr>
-        <w:t xml:space="preserve"> refer to the odour</w:t>
+        <w:t xml:space="preserve"> refer to the </w:t>
+      </w:r>
+      <w:proofErr w:type="spellStart"/>
+      <w:r>
+        <w:rPr>
+          <w:lang w:val="en-US"/>
+        </w:rPr>
+        <w:t>odour</w:t>
       </w:r>
       <w:r>
         <w:rPr>
@@ -3317,6 +4412,7 @@
         </w:rPr>
         <w:t>s</w:t>
       </w:r>
+      <w:proofErr w:type="spellEnd"/>
       <w:r>
         <w:rPr>
           <w:lang w:val="en-US"/>
@@ -3387,7 +4483,21 @@
         <w:rPr>
           <w:lang w:val="en-US"/>
         </w:rPr>
-        <w:t xml:space="preserve">spike times of the MBON e-phys recordings in response </w:t>
+        <w:t>spike times of the MBON e-</w:t>
+      </w:r>
+      <w:proofErr w:type="spellStart"/>
+      <w:r>
+        <w:rPr>
+          <w:lang w:val="en-US"/>
+        </w:rPr>
+        <w:t>phys</w:t>
+      </w:r>
+      <w:proofErr w:type="spellEnd"/>
+      <w:r>
+        <w:rPr>
+          <w:lang w:val="en-US"/>
+        </w:rPr>
+        <w:t xml:space="preserve"> recordings in response </w:t>
       </w:r>
       <w:r>
         <w:rPr>
@@ -3405,7 +4515,21 @@
         <w:rPr>
           <w:lang w:val="en-US"/>
         </w:rPr>
-        <w:t xml:space="preserve"> odour presentation</w:t>
+        <w:t xml:space="preserve"> </w:t>
+      </w:r>
+      <w:proofErr w:type="spellStart"/>
+      <w:r>
+        <w:rPr>
+          <w:lang w:val="en-US"/>
+        </w:rPr>
+        <w:t>odour</w:t>
+      </w:r>
+      <w:proofErr w:type="spellEnd"/>
+      <w:r>
+        <w:rPr>
+          <w:lang w:val="en-US"/>
+        </w:rPr>
+        <w:t xml:space="preserve"> presentation</w:t>
       </w:r>
       <w:r>
         <w:rPr>

</xml_diff>